<commit_message>
Add Consultation Playbook for Stage 3 of Consultancy Pipeline
</commit_message>
<xml_diff>
--- a/microfrontend/upstander_international/artifacts/p3b_First_Video_Script_UpstanderInternational_updated.docx
+++ b/microfrontend/upstander_international/artifacts/p3b_First_Video_Script_UpstanderInternational_updated.docx
@@ -447,7 +447,7 @@
           <w:sz w:val="20"/>
           <w:szCs w:val="20"/>
         </w:rPr>
-        <w:t xml:space="preserve">[BEAT 2] I went through your live site — upstanderonline.com — and found 17-plus broken or empty pages.</w:t>
+        <w:t xml:space="preserve">[BEAT 2] I went through your site and found 17-plus broken pages — your R.E.A.Ch! course page, the $199 course, doesn't load, and the L.E.A.D. corporate course has three broken versions.</w:t>
       </w:r>
     </w:p>
     <w:p>
@@ -462,7 +462,7 @@
           <w:sz w:val="20"/>
           <w:szCs w:val="20"/>
         </w:rPr>
-        <w:t xml:space="preserve">[BEAT 2] Your course page for R.E.A.Ch — the $199 course — doesn't load.</w:t>
+        <w:t xml:space="preserve">[BEAT 2] Your instructor profile shows 16 students enrolled since June 2025.</w:t>
       </w:r>
     </w:p>
     <w:p>
@@ -477,7 +477,7 @@
           <w:sz w:val="20"/>
           <w:szCs w:val="20"/>
         </w:rPr>
-        <w:t xml:space="preserve">[BEAT 2] The L.E.A.D. corporate course has three separate versions that all return errors.</w:t>
+        <w:t xml:space="preserve">[BEAT 2] Not 16 this week. 16 total. Despite an active speaking calendar and media appearances on CNN and MSNBC.</w:t>
       </w:r>
     </w:p>
     <w:p>
@@ -492,7 +492,7 @@
           <w:sz w:val="20"/>
           <w:szCs w:val="20"/>
         </w:rPr>
-        <w:t xml:space="preserve">[BEAT 2] Your instructor profile shows 16 students enrolled since June 2025.</w:t>
+        <w:t xml:space="preserve">[BEAT 2] Your MailPoet setup — meant to capture everyone arriving from your LinkedIn posts — returns an empty page. No opt-in form anywhere.</w:t>
       </w:r>
     </w:p>
     <w:p>
@@ -507,7 +507,7 @@
           <w:sz w:val="20"/>
           <w:szCs w:val="20"/>
         </w:rPr>
-        <w:t xml:space="preserve">[BEAT 2] Not 16 this week. 16 total. Despite an active speaking calendar and media appearances on CNN and MSNBC.</w:t>
+        <w:t xml:space="preserve">[BEAT 3] Here's what I can see from the outside: the checkout is broken, the email capture isn't working, and the site can't be updated without hiring someone.</w:t>
       </w:r>
     </w:p>
     <w:p>
@@ -522,7 +522,7 @@
           <w:sz w:val="20"/>
           <w:szCs w:val="20"/>
         </w:rPr>
-        <w:t xml:space="preserve">[BEAT 2] Your MailPoet setup — the email list tool — returns an empty page. There's no opt-in form on any page I reviewed.</w:t>
+        <w:t xml:space="preserve">[BEAT 3] Here's what I can't see: your email list size, your actual conversion rate, and how many times you've had to hire someone to fix the site this year.</w:t>
       </w:r>
     </w:p>
     <w:p>
@@ -537,7 +537,7 @@
           <w:sz w:val="20"/>
           <w:szCs w:val="20"/>
         </w:rPr>
-        <w:t xml:space="preserve">[BEAT 3] Here's what I can see from the outside: the checkout is broken, the email capture doesn't work, and the site can't be updated without hiring someone.</w:t>
+        <w:t xml:space="preserve">[BEAT 3] Those three numbers are where the real cost lives. I have a rough estimate — but the exact figure is precisely what a proper working session would pin down, using your actual numbers instead of mine.</w:t>
       </w:r>
     </w:p>
     <w:p>
@@ -552,7 +552,7 @@
           <w:sz w:val="20"/>
           <w:szCs w:val="20"/>
         </w:rPr>
-        <w:t xml:space="preserve">[BEAT 3] Here's what I can't see: your actual email list size, what your internal conversion rate looks like, and exactly how many times you've had to hire someone just to fix or update the site in the last year.</w:t>
+        <w:t xml:space="preserve">[BEAT 4] Even at the most conservative end — if only a small fraction of the 6,000 people you speak to each year bought the $199 course online — the broken purchase path is holding back a meaningful revenue stream.</w:t>
       </w:r>
     </w:p>
     <w:p>
@@ -567,7 +567,7 @@
           <w:sz w:val="20"/>
           <w:szCs w:val="20"/>
         </w:rPr>
-        <w:t xml:space="preserve">[BEAT 3] Those are the numbers that determine the real cost. And they're exactly what I'd want to map with you.</w:t>
+        <w:t xml:space="preserve">[BEAT 4] The exact figure is precisely what a proper working session would pin down. But the direction is clear.</w:t>
       </w:r>
     </w:p>
     <w:p>
@@ -582,7 +582,7 @@
           <w:sz w:val="20"/>
           <w:szCs w:val="20"/>
         </w:rPr>
-        <w:t xml:space="preserve">[BEAT 4] Even at the most conservative end — if only a small fraction of the 6,000 people you speak to each year bought the $199 course online — the broken purchase path is holding back a meaningful revenue stream.</w:t>
+        <w:t xml:space="preserve">[BEAT 4] You've said publicly you have three books coming in 2026 — three launch windows, three traffic spikes, all arriving at a site that currently can't sell.</w:t>
       </w:r>
     </w:p>
     <w:p>
@@ -597,37 +597,7 @@
           <w:sz w:val="20"/>
           <w:szCs w:val="20"/>
         </w:rPr>
-        <w:t xml:space="preserve">[BEAT 4] The exact figure is precisely what a proper working session would pin down. But the direction is clear.</w:t>
-      </w:r>
-    </w:p>
-    <w:p>
-      <w:pPr>
-        <w:shd w:fill="f4f4f4" w:val="clear"/>
-        <w:spacing w:after="40" w:before="0"/>
-      </w:pPr>
-      <w:r>
-        <w:rPr>
-          <w:rFonts w:ascii="Courier New" w:cs="Courier New" w:eastAsia="Courier New" w:hAnsi="Courier New"/>
-          <w:color w:val="333333"/>
-          <w:sz w:val="20"/>
-          <w:szCs w:val="20"/>
-        </w:rPr>
-        <w:t xml:space="preserve">[BEAT 4] You've said you have three books coming in 2026. That means three launch windows, three traffic spikes from media — all arriving at a site that currently can't sell.</w:t>
-      </w:r>
-    </w:p>
-    <w:p>
-      <w:pPr>
-        <w:shd w:fill="f4f4f4" w:val="clear"/>
-        <w:spacing w:after="40" w:before="0"/>
-      </w:pPr>
-      <w:r>
-        <w:rPr>
-          <w:rFonts w:ascii="Courier New" w:cs="Courier New" w:eastAsia="Courier New" w:hAnsi="Courier New"/>
-          <w:color w:val="333333"/>
-          <w:sz w:val="20"/>
-          <w:szCs w:val="20"/>
-        </w:rPr>
-        <w:t xml:space="preserve">[BEAT 5] We’ve rebuilt this exact kind of infrastructure for creator-educators before — a broken checkout path and a missing email funnel are two of the most straightforward things we fix. I’d rather be corrected than flattering — whichever of these you push back on tells me what actually matters most in your operation. Reply and let me know.</w:t>
+        <w:t xml:space="preserve">[BEAT 5] We've rebuilt this exact kind of infrastructure for creator-educators before — a broken checkout path and a missing email funnel are two of the most straightforward things we fix. I'd rather be corrected than flattering — whichever of these you push back on tells me what actually matters most in your operation. Reply and let me know.</w:t>
       </w:r>
     </w:p>
     <w:p>
@@ -880,7 +850,7 @@
           <w:sz w:val="22"/>
           <w:szCs w:val="22"/>
         </w:rPr>
-        <w:t xml:space="preserve">Total: ~290 words = ~2.5 min at a calm, unhurried 120 wpm pace.</w:t>
+        <w:t>Total: ~340 words = ~2.5–2.8 min at a calm, unhurried 120 wpm pace.</w:t>
       </w:r>
     </w:p>
     <w:p>
@@ -1050,9 +1020,7 @@
           <w:sz w:val="24"/>
           <w:szCs w:val="24"/>
         </w:rPr>
-        <w:t xml:space="preserve">"You've spoken to more than 6,000 students in a single year. But right now, when those students arrive at your site to buy your course, the checkout page returns a 404 error."
-"This is an outside-in read of what's visible on upstanderonline.com today — and I want to know if I got it right."
-"In the next two and a half minutes, I'll walk through exactly what I found."</w:t>
+        <w:t>"You’ve spoken to more than 6,000 students in a single year. But right now, when those students arrive at your site to buy your course, the checkout page returns a 404 error."</w:t>
       </w:r>
     </w:p>
     <w:p>
@@ -1222,10 +1190,13 @@
           <w:sz w:val="24"/>
           <w:szCs w:val="24"/>
         </w:rPr>
-        <w:t xml:space="preserve">"I went through your live site and found 17-plus broken or empty pages. Your R.E.A.Ch! course page — the $199 course — doesn't load. The L.E.A.D. corporate course has three separate versions that all return errors."
-"Your instructor profile shows 16 students enrolled since June 2025. Not 16 this week. 16 total. Despite an active speaking calendar and media appearances on CNN and MSNBC."
-"Your MailPoet email setup — which should be capturing everyone arriving from your LinkedIn posts — returns an empty page. There's no opt-in form on any page I reviewed."
-"None of this is a guess. These are pages I opened."</w:t>
+        <w:t>"I went through your site and found 17-plus broken pages — your R.E.A.Ch! course page, the $199 course, doesn’t load, and the L.E.A.D. corporate course has three broken versions."</w:t>
+        <w:br/>
+        <w:br/>
+        <w:t>"Your instructor profile shows 16 students enrolled since June 2025. Not 16 this week. 16 total. Despite an active speaking calendar and media appearances on CNN and MSNBC."</w:t>
+        <w:br/>
+        <w:br/>
+        <w:t>"Your MailPoet setup — meant to capture everyone arriving from your LinkedIn posts — returns an empty page. No opt-in form anywhere."</w:t>
       </w:r>
     </w:p>
     <w:p>
@@ -1345,9 +1316,13 @@
           <w:sz w:val="24"/>
           <w:szCs w:val="24"/>
         </w:rPr>
-        <w:t xml:space="preserve">"Here's what I can see from the outside: the checkout is broken, the email capture isn't working, and the site can't be updated without hiring someone."
-"Here's what I can't see: your actual email list size, what your real internal conversion rate looks like, and how many times in the last year you've had to hire someone just to fix or update the site."
-"Those three numbers are where the real cost lives. I have a rough estimate — but the exact figure is precisely what a proper working session would pin down, using your actual numbers instead of mine."</w:t>
+        <w:t>"Here’s what I can see from the outside: the checkout is broken, the email capture isn’t working, and the site can’t be updated without hiring someone."</w:t>
+        <w:br/>
+        <w:br/>
+        <w:t>"Here’s what I can’t see: your email list size, your actual conversion rate, and how many times you’ve had to hire someone to fix the site this year."</w:t>
+        <w:br/>
+        <w:br/>
+        <w:t>"Those three numbers are where the real cost lives. I have a rough estimate — but the exact figure is precisely what a proper working session would pin down, using your actual numbers instead of mine."</w:t>
       </w:r>
     </w:p>
     <w:p>
@@ -1542,9 +1517,10 @@
           <w:sz w:val="24"/>
           <w:szCs w:val="24"/>
         </w:rPr>
-        <w:t xml:space="preserve">"Even at the most conservative end — if only a small fraction of the 6,000 people you speak to each year bought the $199 course online — the broken purchase path is holding back a meaningful revenue stream. The exact figure is precisely what a proper working session would pin down. But the direction is clear."
-"You’ve said publicly you have three books coming in 2026. That means three launch windows, three traffic spikes from media appearances — all arriving at a site that currently can’t sell."
-"Every launch that hits before this is fixed is a window that closes. The gap between the audience you’ve already earned and the 16 students who’ve made it through compounds with every cycle — it doesn’t shrink."</w:t>
+        <w:t>"Even at the most conservative end — if only a small fraction of the 6,000 people you speak to each year bought the $199 course online — the broken purchase path is holding back a meaningful revenue stream. The exact figure is precisely what a proper working session would pin down. But the direction is clear."</w:t>
+        <w:br/>
+        <w:br/>
+        <w:t>"You’ve said publicly you have three books coming in 2026 — three launch windows, three traffic spikes, all arriving at a site that currently can’t sell."</w:t>
       </w:r>
     </w:p>
     <w:p>
@@ -2193,7 +2169,7 @@
           <w:sz w:val="22"/>
           <w:szCs w:val="22"/>
         </w:rPr>
-        <w:t xml:space="preserve">Stakes tie-back: $11,900 figure makes the fee look small.</w:t>
+        <w:t>Stakes tie-back: stays directional (no fixed dollar figure stated) so the fee still lands as small against the implied annual gap.</w:t>
       </w:r>
     </w:p>
     <w:p>

</xml_diff>